<commit_message>
fix(witify-docx): full-width top band, list and heading spacing, footer gap
- Replace the pgBorders top band with a header-anchored rectangle so it
  renders edge to edge in LibreOffice and Word PDF exports.
- Remove contextualSpacing from list styles and give List Bullet and
  List Number 4pt after, so consecutive items no longer touch.
- Increase Heading 1-3 space before and after by 20%.
- Lower the footer distance from 0.75in to 0.4in so the footer no longer
  touches the last body line on a full page.

Co-Authored-By: Claude Fable 5.1 <noreply@anthropic.com>
Claude-Session: https://claude.ai/code/session_011oasBDppUTPVGaQa353QVc
</commit_message>
<xml_diff>
--- a/skills/productivity/witify-docx/template/witify-template.docx
+++ b/skills/productivity/witify-docx/template/witify-template.docx
@@ -187,10 +187,7 @@
       <w:headerReference w:type="default" r:id="rId12"/>
       <w:footerReference w:type="default" r:id="rId13"/>
       <w:pgSz w:w="12240" w:h="15840"/>
-      <w:pgMar w:top="1080" w:right="1080" w:bottom="1080" w:left="1080" w:header="576" w:footer="1080" w:gutter="0"/>
-      <w:pgBorders w:offsetFrom="page" w:display="notFirstPage">
-        <w:top w:val="single" w:sz="36" w:space="0" w:color="1D373D"/>
-      </w:pgBorders>
+      <w:pgMar w:top="1080" w:right="1080" w:bottom="1080" w:left="1080" w:header="576" w:footer="576" w:gutter="0"/>
       <w:pgNumType w:start="0"/>
       <w:cols w:space="720"/>
       <w:titlePg/>
@@ -270,9 +267,50 @@
     </w:pPr>
     <w:r>
       <w:drawing>
+        <wp:anchor xmlns:a="http://schemas.openxmlformats.org/drawingml/2006/main" distT="0" distB="0" distL="0" distR="0" simplePos="0" relativeHeight="0" behindDoc="1" locked="0" layoutInCell="1" allowOverlap="1">
+          <wp:simplePos x="0" y="0"/>
+          <wp:positionH relativeFrom="page">
+            <wp:posOffset>0</wp:posOffset>
+          </wp:positionH>
+          <wp:positionV relativeFrom="page">
+            <wp:posOffset>0</wp:posOffset>
+          </wp:positionV>
+          <wp:extent cx="7772400" cy="57150"/>
+          <wp:effectExtent l="0" t="0" r="0" b="0"/>
+          <wp:wrapNone/>
+          <wp:docPr id="2" name="Top band"/>
+          <wp:cNvGraphicFramePr/>
+          <a:graphic>
+            <a:graphicData uri="http://schemas.microsoft.com/office/word/2010/wordprocessingShape">
+              <wps:wsp>
+                <wps:cNvSpPr/>
+                <wps:spPr>
+                  <a:xfrm>
+                    <a:off x="0" y="0"/>
+                    <a:ext cx="7772400" cy="57150"/>
+                  </a:xfrm>
+                  <a:prstGeom prst="rect">
+                    <a:avLst/>
+                  </a:prstGeom>
+                  <a:solidFill>
+                    <a:srgbClr val="1D373D"/>
+                  </a:solidFill>
+                  <a:ln>
+                    <a:noFill/>
+                  </a:ln>
+                </wps:spPr>
+                <wps:bodyPr/>
+              </wps:wsp>
+            </a:graphicData>
+          </a:graphic>
+        </wp:anchor>
+      </w:drawing>
+    </w:r>
+    <w:r>
+      <w:drawing>
         <wp:inline xmlns:a="http://schemas.openxmlformats.org/drawingml/2006/main" xmlns:pic="http://schemas.openxmlformats.org/drawingml/2006/picture">
           <wp:extent cx="279400" cy="182880"/>
-          <wp:docPr id="1" name="Picture 1"/>
+          <wp:docPr id="3" name="Picture 3"/>
           <wp:cNvGraphicFramePr>
             <a:graphicFrameLocks noChangeAspect="1"/>
           </wp:cNvGraphicFramePr>
@@ -730,7 +768,7 @@
     <w:pPr>
       <w:keepNext/>
       <w:keepLines/>
-      <w:spacing w:before="480" w:after="200"/>
+      <w:spacing w:before="580" w:after="240"/>
       <w:outlineLvl w:val="0"/>
     </w:pPr>
     <w:rPr>
@@ -754,7 +792,7 @@
     <w:pPr>
       <w:keepNext/>
       <w:keepLines/>
-      <w:spacing w:before="200" w:after="120"/>
+      <w:spacing w:before="240" w:after="140"/>
       <w:outlineLvl w:val="1"/>
     </w:pPr>
     <w:rPr>
@@ -778,7 +816,7 @@
     <w:pPr>
       <w:keepNext/>
       <w:keepLines/>
-      <w:spacing w:before="200" w:after="0"/>
+      <w:spacing w:before="240" w:after="0"/>
       <w:outlineLvl w:val="2"/>
     </w:pPr>
     <w:rPr>
@@ -1204,7 +1242,6 @@
         <w:numId w:val="1"/>
       </w:numPr>
       <w:spacing w:after="80"/>
-      <w:contextualSpacing/>
     </w:pPr>
     <w:rPr>
       <w:rFonts w:ascii="Helvetica" w:hAnsi="Helvetica" w:cs="Helvetica" w:eastAsia="Helvetica"/>
@@ -1248,7 +1285,7 @@
       <w:numPr>
         <w:numId w:val="5"/>
       </w:numPr>
-      <w:contextualSpacing/>
+      <w:spacing w:after="80"/>
     </w:pPr>
     <w:rPr>
       <w:rFonts w:ascii="Helvetica" w:hAnsi="Helvetica" w:cs="Helvetica" w:eastAsia="Helvetica"/>

</xml_diff>